<commit_message>
Refresh the build examples: sales funnel, KPI tracking, venture dashboard
Each lands in a different group rather than crowding one: the funnel leads
Selling, KPI tracking leads Running the place, the venture dashboard leads
Tools. They displace the weakest item in each — inbox triage, competency
reviews, and the generic 'dashboard you share with a link'.

The 'and once you can do that' tier now opens on the WhatsApp agent, since
the sales funnel moved into the room and would otherwise have been promised
twice.

Propagated to the home strip, LinkedIn card 4, the posts doc, and Instagram
stories 1, 2 and 5.

make-posts-doc.js -> .cjs: the project sets "type": "module", so as .js it
was parsed as ESM and its require() calls threw. It only ever ran because
it was first written outside the project.

Co-Authored-By: Claude Opus 5 <noreply@anthropic.com>
</commit_message>
<xml_diff>
--- a/marketing/linkedin/linkedin-posts.docx
+++ b/marketing/linkedin/linkedin-posts.docx
@@ -484,7 +484,7 @@
           <w:sz w:val="23"/>
           <w:szCs w:val="23"/>
         </w:rPr>
-        <w:t xml:space="preserve">A 5-year cashflow model with real COS and channel margins. Your month-end pack, rebuilt from the source spreadsheets instead of by hand. An investor deck you can actually defend in the room. A Monday 07:00 business brief that writes itself. A dashboard you send someone a link to. The SOPs you've never got around to writing down.</w:t>
+        <w:t xml:space="preserve">An automated sales funnel — lead in, researched, followed up. KPI tracking that chases the team for the number instead of you. A custom dashboard for your venture, live on your own figures. A 5-year cashflow model with real COS and channel margins. Your month-end pack, rebuilt from source instead of by hand. The SOPs you've never got around to writing down.</w:t>
       </w:r>
     </w:p>
     <w:p>
@@ -554,7 +554,7 @@
           <w:sz w:val="23"/>
           <w:szCs w:val="23"/>
         </w:rPr>
-        <w:t xml:space="preserve">Once you can do this, the bigger stuff opens up: a sales pipeline that researches and drafts the follow-up while you approve. Customer relationships run by exception, so you only see the ones that need you. Recruitment screening against your actual scorecard.</w:t>
+        <w:t xml:space="preserve">Once you can do this, the bigger stuff opens up: a WhatsApp agent taking first contact, with every draft held for your approval. Customer relationships run by exception, so you only see the ones that need you. Recruitment screened against your actual scorecard.</w:t>
       </w:r>
     </w:p>
     <w:p>

</xml_diff>